<commit_message>
Date range picker replaces preset windows; Buy Box removed
- The window selector is now a from/to date range picker defaulting to a single
  day, not preset 1d/7d/14d/30d/90d buttons. Presets cannot express "the three
  days around the deal" or "since the price change", which is what people
  actually need to look at. A length badge (1 day, 12 days) shows the selected
  span so a wide range is not misread as a daily figure.
- Buy Box removed from the profile, the field list, the exception list and the
  delta baselines.

Applied across the mockup, the markdown spec and the Word generator.

Co-Authored-By: Claude Opus 5 <noreply@anthropic.com>
Claude-Session: https://claude.ai/code/session_013Jgu1h5Tqz8Agx7APLepUp
</commit_message>
<xml_diff>
--- a/build/Campaign-Daily-Oversight-Spec.docx
+++ b/build/Campaign-Daily-Oversight-Spec.docx
@@ -875,7 +875,7 @@
           <w:sz w:val="20"/>
           <w:szCs w:val="20"/>
         </w:rPr>
-        <w:t xml:space="preserve">The selector must offer 1d, and 1d is the default — this is the daily tier. </w:t>
+        <w:t xml:space="preserve">A date range picker (from / to), not preset buttons. </w:t>
       </w:r>
       <w:r>
         <w:rPr>
@@ -884,7 +884,7 @@
           <w:sz w:val="20"/>
           <w:szCs w:val="20"/>
         </w:rPr>
-        <w:t xml:space="preserve">A bad yesterday is invisible inside a 30-day average, and the existing Performance Monitor defaults to 30d. Longer windows (7d / 14d / 30d / 90d) stay available for context, but the pass is run on 1d with the 7-day rolling figures beside it.</w:t>
+        <w:t xml:space="preserve">Presets cannot express "the three days around the deal" or "since the price change", which is what people actually need to look at. It defaults to a SINGLE DAY, because this is the daily tier and a bad yesterday is invisible inside a 30-day average; the existing Performance Monitor defaults to 30d. Show the selected span as a length badge (1 day, 12 days) so nobody misreads a wide range as a daily figure, and keep the 7-day rolling values beside the day figures regardless of the range chosen.</w:t>
       </w:r>
     </w:p>
     <w:p>

</xml_diff>